<commit_message>
feat(sfre): PostgreSQL persistence, worker-thread runs, data ingestion (TEFAS/BIST/holdings/KAP client), real-data blind replay, ops guide
Verified on PostgreSQL 16 (restart survival, append-only triggers, tamper detection). KAP response schema and real-file column names remain unverified until first live use.

Co-Authored-By: Claude Sonnet 5.5 <noreply@anthropic.com>
Claude-Session: https://claude.ai/code/session_01GHfiU7wDs2tjZkYPdKH4uw
</commit_message>
<xml_diff>
--- a/docs/sfre/SFRE_TECHNICAL_REPORT.docx
+++ b/docs/sfre/SFRE_TECHNICAL_REPORT.docx
@@ -3683,6 +3683,255 @@
           <w:szCs w:val="22"/>
         </w:rPr>
         <w:t xml:space="preserve"> olarak kullanılmalı; hiçbir çıktı yatırım tavsiyesi veya suç isnadı olarak sunulamaz.</w:t>
+      </w:r>
+    </w:p>
+    <w:p>
+      <w:pPr>
+        <w:spacing w:after="120" w:before="120" w:line="276"/>
+      </w:pPr>
+      <w:r>
+        <w:rPr>
+          <w:rFonts w:ascii="Times New Roman" w:cs="Times New Roman" w:eastAsia="Times New Roman" w:hAnsi="Times New Roman"/>
+          <w:b/>
+          <w:bCs/>
+          <w:sz w:val="28"/>
+          <w:szCs w:val="28"/>
+        </w:rPr>
+        <w:t xml:space="preserve">15. Güncelleme — "anahtar eklemek dışında hazır" çalışması (2026-10-01)</w:t>
+      </w:r>
+    </w:p>
+    <w:p>
+      <w:pPr>
+        <w:spacing w:after="120" w:before="120" w:line="276"/>
+      </w:pPr>
+      <w:r>
+        <w:rPr>
+          <w:rFonts w:ascii="Times New Roman" w:cs="Times New Roman" w:eastAsia="Times New Roman" w:hAnsi="Times New Roman"/>
+          <w:b w:val="false"/>
+          <w:bCs w:val="false"/>
+          <w:sz w:val="22"/>
+          <w:szCs w:val="22"/>
+        </w:rPr>
+        <w:t xml:space="preserve">Kapatılan blocker'lar: (3) PostgreSQL kalıcılığı artık </w:t>
+      </w:r>
+      <w:r>
+        <w:rPr>
+          <w:rFonts w:ascii="Times New Roman" w:cs="Times New Roman" w:eastAsia="Times New Roman" w:hAnsi="Times New Roman"/>
+          <w:b/>
+          <w:bCs/>
+          <w:sz w:val="22"/>
+          <w:szCs w:val="22"/>
+        </w:rPr>
+        <w:t xml:space="preserve">gerçek PostgreSQL 16 üzerinde test edildi</w:t>
+      </w:r>
+      <w:r>
+        <w:rPr>
+          <w:rFonts w:ascii="Times New Roman" w:cs="Times New Roman" w:eastAsia="Times New Roman" w:hAnsi="Times New Roman"/>
+          <w:b w:val="false"/>
+          <w:bCs w:val="false"/>
+          <w:sz w:val="22"/>
+          <w:szCs w:val="22"/>
+        </w:rPr>
+        <w:t xml:space="preserve"> (ledger/gözlem/koşu/governance yeniden başlatmadan sağ çıkıyor; DB tetikleyicileri UPDATE/DELETE'i reddediyor; ledger'da yetkili müdahale yükleme sırasında yakalanıyor); (4) ağır hesaplar worker thread'de (zaman aşımı 120 sn → 504, eşzamanlılık sınırı → 429). Test sırasında bulunan gerçek hatalar: şema tetikleyicilerinin başka şemada oluşmaması, genel "kod" sütun takma adının fon sütununu yutması, aynı dosyanın yeniden yüklenmesinin çift kayıt üretmesi (ingestion zamanı hash dışına alındı).</w:t>
+      </w:r>
+    </w:p>
+    <w:p>
+      <w:pPr>
+        <w:spacing w:after="120" w:before="120" w:line="276"/>
+      </w:pPr>
+      <w:r>
+        <w:rPr>
+          <w:rFonts w:ascii="Times New Roman" w:cs="Times New Roman" w:eastAsia="Times New Roman" w:hAnsi="Times New Roman"/>
+          <w:b w:val="false"/>
+          <w:bCs w:val="false"/>
+          <w:sz w:val="22"/>
+          <w:szCs w:val="22"/>
+        </w:rPr>
+        <w:t xml:space="preserve">Eklenenler: TEFAS/BIST EOD/fiili dolaşım/holdings içe aktarıcıları (</w:t>
+      </w:r>
+      <w:r>
+        <w:rPr>
+          <w:rFonts w:ascii="Times New Roman" w:cs="Times New Roman" w:eastAsia="Times New Roman" w:hAnsi="Times New Roman"/>
+          <w:sz w:val="22"/>
+          <w:szCs w:val="22"/>
+        </w:rPr>
+        <w:t xml:space="preserve">server/src/sfre/ingest</w:t>
+      </w:r>
+      <w:r>
+        <w:rPr>
+          <w:rFonts w:ascii="Times New Roman" w:cs="Times New Roman" w:eastAsia="Times New Roman" w:hAnsi="Times New Roman"/>
+          <w:b w:val="false"/>
+          <w:bCs w:val="false"/>
+          <w:sz w:val="22"/>
+          <w:szCs w:val="22"/>
+        </w:rPr>
+        <w:t xml:space="preserve">), MKK KAP REST istemcisi, </w:t>
+      </w:r>
+      <w:r>
+        <w:rPr>
+          <w:rFonts w:ascii="Times New Roman" w:cs="Times New Roman" w:eastAsia="Times New Roman" w:hAnsi="Times New Roman"/>
+          <w:sz w:val="22"/>
+          <w:szCs w:val="22"/>
+        </w:rPr>
+        <w:t xml:space="preserve">npm run sfre:ingest|sfre:replay</w:t>
+      </w:r>
+      <w:r>
+        <w:rPr>
+          <w:rFonts w:ascii="Times New Roman" w:cs="Times New Roman" w:eastAsia="Times New Roman" w:hAnsi="Times New Roman"/>
+          <w:b w:val="false"/>
+          <w:bCs w:val="false"/>
+          <w:sz w:val="22"/>
+          <w:szCs w:val="22"/>
+        </w:rPr>
+        <w:t xml:space="preserve">, gerçek-veri blind replay (</w:t>
+      </w:r>
+      <w:r>
+        <w:rPr>
+          <w:rFonts w:ascii="Times New Roman" w:cs="Times New Roman" w:eastAsia="Times New Roman" w:hAnsi="Times New Roman"/>
+          <w:sz w:val="22"/>
+          <w:szCs w:val="22"/>
+        </w:rPr>
+        <w:t xml:space="preserve">validation/realReplay.js</w:t>
+      </w:r>
+      <w:r>
+        <w:rPr>
+          <w:rFonts w:ascii="Times New Roman" w:cs="Times New Roman" w:eastAsia="Times New Roman" w:hAnsi="Times New Roman"/>
+          <w:b w:val="false"/>
+          <w:bCs w:val="false"/>
+          <w:sz w:val="22"/>
+          <w:szCs w:val="22"/>
+        </w:rPr>
+        <w:t xml:space="preserve">, eşik yalnızca etiketsiz pencere-öncesi verisiyle), </w:t>
+      </w:r>
+      <w:r>
+        <w:rPr>
+          <w:rFonts w:ascii="Times New Roman" w:cs="Times New Roman" w:eastAsia="Times New Roman" w:hAnsi="Times New Roman"/>
+          <w:sz w:val="22"/>
+          <w:szCs w:val="22"/>
+        </w:rPr>
+        <w:t xml:space="preserve">/sfre</w:t>
+      </w:r>
+      <w:r>
+        <w:rPr>
+          <w:rFonts w:ascii="Times New Roman" w:cs="Times New Roman" w:eastAsia="Times New Roman" w:hAnsi="Times New Roman"/>
+          <w:b w:val="false"/>
+          <w:bCs w:val="false"/>
+          <w:sz w:val="22"/>
+          <w:szCs w:val="22"/>
+        </w:rPr>
+        <w:t xml:space="preserve"> sayfasında depolama/sağlayıcı/veri durumu, </w:t>
+      </w:r>
+      <w:r>
+        <w:rPr>
+          <w:rFonts w:ascii="Times New Roman" w:cs="Times New Roman" w:eastAsia="Times New Roman" w:hAnsi="Times New Roman"/>
+          <w:sz w:val="22"/>
+          <w:szCs w:val="22"/>
+        </w:rPr>
+        <w:t xml:space="preserve">docs/sfre/OPERATIONS.md</w:t>
+      </w:r>
+      <w:r>
+        <w:rPr>
+          <w:rFonts w:ascii="Times New Roman" w:cs="Times New Roman" w:eastAsia="Times New Roman" w:hAnsi="Times New Roman"/>
+          <w:b w:val="false"/>
+          <w:bCs w:val="false"/>
+          <w:sz w:val="22"/>
+          <w:szCs w:val="22"/>
+        </w:rPr>
+        <w:t xml:space="preserve">, CI'da PostgreSQL servisi.</w:t>
+      </w:r>
+    </w:p>
+    <w:p>
+      <w:pPr>
+        <w:spacing w:after="120" w:before="120" w:line="276"/>
+      </w:pPr>
+      <w:r>
+        <w:rPr>
+          <w:rFonts w:ascii="Times New Roman" w:cs="Times New Roman" w:eastAsia="Times New Roman" w:hAnsi="Times New Roman"/>
+          <w:b w:val="false"/>
+          <w:bCs w:val="false"/>
+          <w:sz w:val="22"/>
+          <w:szCs w:val="22"/>
+        </w:rPr>
+        <w:t xml:space="preserve">Test: SFRE 209 test (PostgreSQL ile), sunucu toplam 796 geçti (+ ortam kaynaklı </w:t>
+      </w:r>
+      <w:r>
+        <w:rPr>
+          <w:rFonts w:ascii="Times New Roman" w:cs="Times New Roman" w:eastAsia="Times New Roman" w:hAnsi="Times New Roman"/>
+          <w:sz w:val="22"/>
+          <w:szCs w:val="22"/>
+        </w:rPr>
+        <w:t xml:space="preserve">sync.e2e</w:t>
+      </w:r>
+      <w:r>
+        <w:rPr>
+          <w:rFonts w:ascii="Times New Roman" w:cs="Times New Roman" w:eastAsia="Times New Roman" w:hAnsi="Times New Roman"/>
+          <w:b w:val="false"/>
+          <w:bCs w:val="false"/>
+          <w:sz w:val="22"/>
+          <w:szCs w:val="22"/>
+        </w:rPr>
+        <w:t xml:space="preserve"> yüklenemiyor), typecheck/lint temiz. Gerçek sunucu PG ile ayağa kaldırıldı; </w:t>
+      </w:r>
+      <w:r>
+        <w:rPr>
+          <w:rFonts w:ascii="Times New Roman" w:cs="Times New Roman" w:eastAsia="Times New Roman" w:hAnsi="Times New Roman"/>
+          <w:sz w:val="22"/>
+          <w:szCs w:val="22"/>
+        </w:rPr>
+        <w:t xml:space="preserve">/api/sfre/health</w:t>
+      </w:r>
+      <w:r>
+        <w:rPr>
+          <w:rFonts w:ascii="Times New Roman" w:cs="Times New Roman" w:eastAsia="Times New Roman" w:hAnsi="Times New Roman"/>
+          <w:b w:val="false"/>
+          <w:bCs w:val="false"/>
+          <w:sz w:val="22"/>
+          <w:szCs w:val="22"/>
+        </w:rPr>
+        <w:t xml:space="preserve"> ve </w:t>
+      </w:r>
+      <w:r>
+        <w:rPr>
+          <w:rFonts w:ascii="Times New Roman" w:cs="Times New Roman" w:eastAsia="Times New Roman" w:hAnsi="Times New Roman"/>
+          <w:sz w:val="22"/>
+          <w:szCs w:val="22"/>
+        </w:rPr>
+        <w:t xml:space="preserve">/data/status</w:t>
+      </w:r>
+      <w:r>
+        <w:rPr>
+          <w:rFonts w:ascii="Times New Roman" w:cs="Times New Roman" w:eastAsia="Times New Roman" w:hAnsi="Times New Roman"/>
+          <w:b w:val="false"/>
+          <w:bCs w:val="false"/>
+          <w:sz w:val="22"/>
+          <w:szCs w:val="22"/>
+        </w:rPr>
+        <w:t xml:space="preserve"> yanıt verdi; CLI ile örnek TEFAS dosyası yüklendi, tekrar yükleme çift kayıt üretmedi.</w:t>
+      </w:r>
+    </w:p>
+    <w:p>
+      <w:pPr>
+        <w:spacing w:after="120" w:before="120" w:line="276"/>
+      </w:pPr>
+      <w:r>
+        <w:rPr>
+          <w:rFonts w:ascii="Times New Roman" w:cs="Times New Roman" w:eastAsia="Times New Roman" w:hAnsi="Times New Roman"/>
+          <w:b/>
+          <w:bCs/>
+          <w:sz w:val="22"/>
+          <w:szCs w:val="22"/>
+        </w:rPr>
+        <w:t xml:space="preserve">Hâlâ doğrulanmamış:</w:t>
+      </w:r>
+      <w:r>
+        <w:rPr>
+          <w:rFonts w:ascii="Times New Roman" w:cs="Times New Roman" w:eastAsia="Times New Roman" w:hAnsi="Times New Roman"/>
+          <w:b w:val="false"/>
+          <w:bCs w:val="false"/>
+          <w:sz w:val="22"/>
+          <w:szCs w:val="22"/>
+        </w:rPr>
+        <w:t xml:space="preserve"> KAP API'nin taban URL'si, auth başlığı, parametreleri ve yanıt şeması (kamuya açık PDF vermiyor; istemci yapılandırılabilir ve şemayı tahmin etmez, kaydı reddeder); TEFAS/BIST dosya sütun adları gerçek dosyalarla denenmedi (sentetik başlıklarla test edildi; tanınmayan sütunlar raporlanır, tahmin edilmez). Bunlar ilk gerçek dosya/anahtarla bir kez doğrulanmalı.</w:t>
       </w:r>
     </w:p>
     <w:sectPr>

</xml_diff>